<commit_message>
Actualizando texto en la presentación
</commit_message>
<xml_diff>
--- a/PROYECTO_FINAL.docx
+++ b/PROYECTO_FINAL.docx
@@ -9578,218 +9578,6 @@
       <w:tr>
         <w:tc>
           <w:tcPr>
-            <w:tcW w:w="3739" w:type="dxa"/>
-            <w:gridSpan w:val="2"/>
-            <w:vAlign w:val="center"/>
-          </w:tcPr>
-          <w:p>
-            <w:pPr>
-              <w:pStyle w:val="Prrafodelista"/>
-              <w:ind w:left="0"/>
-              <w:jc w:val="center"/>
-              <w:rPr>
-                <w:sz w:val="20"/>
-                <w:szCs w:val="20"/>
-              </w:rPr>
-            </w:pPr>
-            <w:r>
-              <w:rPr>
-                <w:sz w:val="20"/>
-                <w:szCs w:val="20"/>
-              </w:rPr>
-              <w:t>Ruiz Tangoa Ray Nixon</w:t>
-            </w:r>
-          </w:p>
-        </w:tc>
-        <w:tc>
-          <w:tcPr>
-            <w:tcW w:w="567" w:type="dxa"/>
-            <w:vAlign w:val="center"/>
-          </w:tcPr>
-          <w:p>
-            <w:pPr>
-              <w:pStyle w:val="Prrafodelista"/>
-              <w:ind w:left="0"/>
-              <w:jc w:val="center"/>
-              <w:rPr>
-                <w:sz w:val="20"/>
-                <w:szCs w:val="20"/>
-              </w:rPr>
-            </w:pPr>
-            <w:r>
-              <w:rPr>
-                <w:sz w:val="20"/>
-                <w:szCs w:val="20"/>
-              </w:rPr>
-              <w:t>100</w:t>
-            </w:r>
-          </w:p>
-        </w:tc>
-        <w:tc>
-          <w:tcPr>
-            <w:tcW w:w="2268" w:type="dxa"/>
-            <w:vAlign w:val="center"/>
-          </w:tcPr>
-          <w:p>
-            <w:pPr>
-              <w:pStyle w:val="Prrafodelista"/>
-              <w:ind w:left="0"/>
-              <w:jc w:val="center"/>
-              <w:rPr>
-                <w:sz w:val="20"/>
-                <w:szCs w:val="20"/>
-              </w:rPr>
-            </w:pPr>
-            <w:r>
-              <w:rPr>
-                <w:sz w:val="20"/>
-                <w:szCs w:val="20"/>
-              </w:rPr>
-              <w:t>6 meses</w:t>
-            </w:r>
-          </w:p>
-        </w:tc>
-        <w:tc>
-          <w:tcPr>
-            <w:tcW w:w="1560" w:type="dxa"/>
-            <w:vAlign w:val="center"/>
-          </w:tcPr>
-          <w:p>
-            <w:pPr>
-              <w:pStyle w:val="Prrafodelista"/>
-              <w:ind w:left="0"/>
-              <w:jc w:val="center"/>
-              <w:rPr>
-                <w:sz w:val="20"/>
-                <w:szCs w:val="20"/>
-              </w:rPr>
-            </w:pPr>
-            <w:r>
-              <w:rPr>
-                <w:sz w:val="20"/>
-                <w:szCs w:val="20"/>
-              </w:rPr>
-              <w:t>600</w:t>
-            </w:r>
-          </w:p>
-        </w:tc>
-      </w:tr>
-      <w:tr>
-        <w:tc>
-          <w:tcPr>
-            <w:tcW w:w="3739" w:type="dxa"/>
-            <w:gridSpan w:val="2"/>
-            <w:tcBorders>
-              <w:bottom w:val="single" w:sz="4" w:space="0" w:color="auto"/>
-            </w:tcBorders>
-          </w:tcPr>
-          <w:p>
-            <w:pPr>
-              <w:pStyle w:val="Prrafodelista"/>
-              <w:ind w:left="0"/>
-              <w:jc w:val="center"/>
-              <w:rPr>
-                <w:sz w:val="20"/>
-                <w:szCs w:val="20"/>
-              </w:rPr>
-            </w:pPr>
-            <w:r>
-              <w:rPr>
-                <w:sz w:val="20"/>
-                <w:szCs w:val="20"/>
-              </w:rPr>
-              <w:t xml:space="preserve">Bustamante Barturen, José </w:t>
-            </w:r>
-            <w:proofErr w:type="spellStart"/>
-            <w:r>
-              <w:rPr>
-                <w:sz w:val="20"/>
-                <w:szCs w:val="20"/>
-              </w:rPr>
-              <w:t>Jhonatan</w:t>
-            </w:r>
-            <w:proofErr w:type="spellEnd"/>
-          </w:p>
-        </w:tc>
-        <w:tc>
-          <w:tcPr>
-            <w:tcW w:w="567" w:type="dxa"/>
-            <w:tcBorders>
-              <w:bottom w:val="single" w:sz="4" w:space="0" w:color="auto"/>
-            </w:tcBorders>
-          </w:tcPr>
-          <w:p>
-            <w:pPr>
-              <w:pStyle w:val="Prrafodelista"/>
-              <w:ind w:left="0"/>
-              <w:jc w:val="center"/>
-              <w:rPr>
-                <w:sz w:val="20"/>
-                <w:szCs w:val="20"/>
-              </w:rPr>
-            </w:pPr>
-            <w:r>
-              <w:rPr>
-                <w:sz w:val="20"/>
-                <w:szCs w:val="20"/>
-              </w:rPr>
-              <w:t>100</w:t>
-            </w:r>
-          </w:p>
-        </w:tc>
-        <w:tc>
-          <w:tcPr>
-            <w:tcW w:w="2268" w:type="dxa"/>
-            <w:tcBorders>
-              <w:bottom w:val="single" w:sz="4" w:space="0" w:color="auto"/>
-            </w:tcBorders>
-          </w:tcPr>
-          <w:p>
-            <w:pPr>
-              <w:pStyle w:val="Prrafodelista"/>
-              <w:ind w:left="0"/>
-              <w:jc w:val="center"/>
-              <w:rPr>
-                <w:sz w:val="20"/>
-                <w:szCs w:val="20"/>
-              </w:rPr>
-            </w:pPr>
-            <w:r>
-              <w:rPr>
-                <w:sz w:val="20"/>
-                <w:szCs w:val="20"/>
-              </w:rPr>
-              <w:t>6 meses</w:t>
-            </w:r>
-          </w:p>
-        </w:tc>
-        <w:tc>
-          <w:tcPr>
-            <w:tcW w:w="1560" w:type="dxa"/>
-          </w:tcPr>
-          <w:p>
-            <w:pPr>
-              <w:pStyle w:val="Prrafodelista"/>
-              <w:ind w:left="0"/>
-              <w:jc w:val="center"/>
-              <w:rPr>
-                <w:sz w:val="20"/>
-                <w:szCs w:val="20"/>
-              </w:rPr>
-            </w:pPr>
-            <w:r>
-              <w:rPr>
-                <w:sz w:val="20"/>
-                <w:szCs w:val="20"/>
-              </w:rPr>
-              <w:t>600</w:t>
-            </w:r>
-          </w:p>
-        </w:tc>
-      </w:tr>
-      <w:tr>
-        <w:tc>
-          <w:tcPr>
             <w:tcW w:w="6574" w:type="dxa"/>
             <w:gridSpan w:val="4"/>
             <w:tcBorders>
@@ -9843,7 +9631,7 @@
                 <w:sz w:val="20"/>
                 <w:szCs w:val="20"/>
               </w:rPr>
-              <w:t>1.200</w:t>
+              <w:t>0</w:t>
             </w:r>
           </w:p>
         </w:tc>
@@ -12006,7 +11794,7 @@
       </w:tr>
       <w:tr>
         <w:trPr>
-          <w:trHeight w:val="1297"/>
+          <w:trHeight w:val="592"/>
         </w:trPr>
         <w:tc>
           <w:tcPr>
@@ -12056,7 +11844,7 @@
             <w:tcW w:w="1560" w:type="dxa"/>
             <w:tcBorders>
               <w:bottom w:val="single" w:sz="4" w:space="0" w:color="auto"/>
-              <w:right w:val="single" w:sz="4" w:space="0" w:color="auto"/>
+              <w:right w:val="nil"/>
             </w:tcBorders>
             <w:vAlign w:val="center"/>
           </w:tcPr>
@@ -12082,24 +11870,44 @@
                 <w:sz w:val="20"/>
                 <w:szCs w:val="20"/>
               </w:rPr>
-              <w:t>2.076</w:t>
+              <w:t>876</w:t>
             </w:r>
           </w:p>
         </w:tc>
       </w:tr>
     </w:tbl>
+    <w:p>
+      <w:pPr>
+        <w:outlineLvl w:val="1"/>
+      </w:pPr>
+      <w:bookmarkStart w:id="8" w:name="_Toc220433834"/>
+    </w:p>
+    <w:p>
+      <w:pPr>
+        <w:spacing w:line="259" w:lineRule="auto"/>
+        <w:jc w:val="left"/>
+      </w:pPr>
+      <w:r>
+        <w:br w:type="page"/>
+      </w:r>
+    </w:p>
+    <w:p>
+      <w:pPr>
+        <w:pStyle w:val="Prrafodelista"/>
+        <w:ind w:left="792"/>
+        <w:outlineLvl w:val="1"/>
+      </w:pPr>
+    </w:p>
     <w:p>
       <w:pPr>
         <w:pStyle w:val="Prrafodelista"/>
         <w:numPr>
           <w:ilvl w:val="1"/>
-          <w:numId w:val="6"/>
+          <w:numId w:val="1"/>
         </w:numPr>
         <w:outlineLvl w:val="1"/>
       </w:pPr>
-      <w:bookmarkStart w:id="8" w:name="_Toc220433834"/>
-      <w:r>
-        <w:lastRenderedPageBreak/>
+      <w:r>
         <w:t>Financiamiento</w:t>
       </w:r>
       <w:bookmarkEnd w:id="8"/>
@@ -12446,19 +12254,8 @@
                 <w:sz w:val="20"/>
                 <w:szCs w:val="20"/>
               </w:rPr>
-              <w:t>Recursos Propios </w:t>
-            </w:r>
-          </w:p>
-          <w:p>
-            <w:pPr>
-              <w:pStyle w:val="Prrafodelista"/>
-              <w:ind w:left="0"/>
-              <w:jc w:val="center"/>
-              <w:rPr>
-                <w:sz w:val="20"/>
-                <w:szCs w:val="20"/>
-              </w:rPr>
-            </w:pPr>
+              <w:t xml:space="preserve">El Investigador </w:t>
+            </w:r>
           </w:p>
         </w:tc>
       </w:tr>
@@ -12964,6 +12761,13 @@
                 <w:sz w:val="20"/>
                 <w:szCs w:val="20"/>
               </w:rPr>
+              <w:t xml:space="preserve">S/. </w:t>
+            </w:r>
+            <w:r>
+              <w:rPr>
+                <w:sz w:val="20"/>
+                <w:szCs w:val="20"/>
+              </w:rPr>
               <w:t>4.780,6</w:t>
             </w:r>
           </w:p>
@@ -13119,7 +12923,7 @@
                 <w:sz w:val="20"/>
                 <w:szCs w:val="20"/>
               </w:rPr>
-              <w:t>Recursos Propios </w:t>
+              <w:t xml:space="preserve">El Investigador </w:t>
             </w:r>
           </w:p>
           <w:p>
@@ -13644,7 +13448,7 @@
                 <w:sz w:val="20"/>
                 <w:szCs w:val="20"/>
               </w:rPr>
-              <w:t>2.076</w:t>
+              <w:t>876</w:t>
             </w:r>
             <w:r>
               <w:rPr>
@@ -13702,7 +13506,7 @@
         <w:pStyle w:val="Prrafodelista"/>
         <w:numPr>
           <w:ilvl w:val="1"/>
-          <w:numId w:val="6"/>
+          <w:numId w:val="1"/>
         </w:numPr>
         <w:outlineLvl w:val="1"/>
       </w:pPr>
@@ -32403,7 +32207,6 @@
   <w:style w:type="character" w:default="1" w:styleId="Fuentedeprrafopredeter">
     <w:name w:val="Default Paragraph Font"/>
     <w:uiPriority w:val="1"/>
-    <w:semiHidden/>
     <w:unhideWhenUsed/>
   </w:style>
   <w:style w:type="table" w:default="1" w:styleId="Tablanormal">
@@ -33064,6 +32867,7 @@
     <w:rsid w:val="005C04ED"/>
     <w:rsid w:val="0063758B"/>
     <w:rsid w:val="00646E8C"/>
+    <w:rsid w:val="00657364"/>
     <w:rsid w:val="00693030"/>
     <w:rsid w:val="006A3942"/>
     <w:rsid w:val="006C1611"/>
@@ -33080,6 +32884,7 @@
     <w:rsid w:val="008C25DA"/>
     <w:rsid w:val="008E251D"/>
     <w:rsid w:val="00945324"/>
+    <w:rsid w:val="00946E02"/>
     <w:rsid w:val="00980E01"/>
     <w:rsid w:val="009D4745"/>
     <w:rsid w:val="009D6704"/>

</xml_diff>